<commit_message>
Updated readme and docs
</commit_message>
<xml_diff>
--- a/docs/brd.docx
+++ b/docs/brd.docx
@@ -24,8 +24,9 @@
       </w:r>
     </w:p>
     <w:p>
+      <w:pPr/>
       <w:r>
-        <w:t>Deliver a public web experience, role-specific operational dashboards and a versioned REST API. Use the prototype as the interaction reference, not as the security or persistence design. The MVP includes informative and verified listings, temple bookings/donations, dated festival events and offerings, service-professional profiles and appointment enquiries, sponsorships/subscriptions, staff review, chart and payout visibility, partner/dealer wallets, support and administration. Service appointment fees are paid directly to professionals in this MVP; do not build a platform appointment payout ledger. Festival tools should remain practical programme/day-sheet tools rather than full ERP accounting. Two additional prototype flows must both be carried into the MVP as distinct commercial paths, not merged: a public self-serve, login-free, multi-temple sponsorship flow, and a field-partner-mediated checkout that sells a plan and/or sponsorship for one specific temple with automatic partner/dealer commission.</w:t>
+        <w:t>Deliver a public web experience, role-specific operational dashboards and a versioned REST API. Use the prototype as the interaction reference, not as the security or persistence design. The MVP includes public submissions, signed-in listing creation, staff moderation, bookings, sponsorship checkout, tax invoices, partner attribution, payments, Mini ERP fulfilment and role-specific operations. Commercial sales now use one sponsorship checkout; the partner dashboard no longer has a separate product-sales flow.</w:t>
       </w:r>
     </w:p>
     <w:p>
@@ -200,7 +201,7 @@
         <w:pStyle w:val="ListBullet"/>
       </w:pPr>
       <w:r>
-        <w:t>Plan pricing: the prototype shows at least three different plan-price lists — a temple's own plan field (Free/Basic/Pro), the administrator's plan-editing screen (Free/Temple Basic ₹6,000/Temple Pro ₹15,000/Service Premium ₹2,999, each with its own feature flags such as white-label, custom domain and admin phone-number limits), and the newer partner-checkout screen (Basic ₹4,000/Premium ₹10,000/Mini Billing App ₹5,000 one-time). One price book must be approved before any of this is coded.</w:t>
+        <w:t>Plan pricing: the prototype still contains older plan-price examples alongside the sponsorship-checkout packages. One price book covering Supporter, Patron, Benefactor and Temple Billing mini ERP must be approved before production implementation.</w:t>
       </w:r>
     </w:p>
     <w:p>
@@ -208,7 +209,7 @@
         <w:pStyle w:val="ListBullet"/>
       </w:pPr>
       <w:r>
-        <w:t>Commission model: the newer checkout previews a flat 10% partner / 5% dealer commission on plain rupee wallets, while older wallet panels instead show a dealer credit fixed at 10% of every partner credit, with partner rates varying by event (roughly 15% on a new plan or sponsorship, 5% on a renewal, a flat fee on a referred listing, and so on). Only one commission formula should be built.</w:t>
+        <w:t>Commission model: the sponsorship checkout previews a flat 10% partner and 5% dealer commission, while older wallet panels show different rules. Only one commission formula should be built.</w:t>
       </w:r>
     </w:p>
     <w:p>
@@ -315,6 +316,91 @@
     <w:p>
       <w:r>
         <w:t>Before building checkout or ledgers, TempleAddress must approve: one price book and commission/dealer formula (resolving the plan-pricing and commission-rate conflicts described above); whether the legacy points-based reward tool and the affiliate referral tier are kept, changed or dropped; fee and tax rules; 80G eligibility; cancellation windows; festival settlement and permit policy; renewal terms; the WhatsApp business messaging provider and AI-assistant model provider; the scope and pricing of the white-label/custom-domain feature; one consistent team/permission model across vendor types; React versus Next.js page ownership; and measurable service targets. Record each decision and any deviation from prototype behaviour.</w:t>
+      </w:r>
+    </w:p>
+    <w:p>
+      <w:pPr>
+        <w:pStyle w:val="Heading1"/>
+      </w:pPr>
+      <w:r>
+        <w:t>Current listing and sponsorship decisions</w:t>
+      </w:r>
+    </w:p>
+    <w:p>
+      <w:r>
+        <w:t>The following decisions reflect the current prototype and should guide API and UI implementation. They do not require a database-model change in this prototype repository.</w:t>
+      </w:r>
+    </w:p>
+    <w:p>
+      <w:pPr>
+        <w:pStyle w:val="ListBullet"/>
+      </w:pPr>
+      <w:r>
+        <w:t>Landing entry: Submit a temple opens a public no-login contact form. Create a profile requires OTP or Google login and then opens the full listing editor. Claim actions belong only on a specific listing detail page.</w:t>
+      </w:r>
+    </w:p>
+    <w:p>
+      <w:pPr>
+        <w:pStyle w:val="ListBullet"/>
+      </w:pPr>
+      <w:r>
+        <w:t>Listing workflow: devotees and partners may create, view and edit listings. Save every section as a draft and expose drafts to authorised staff. Photos and KYC documents remain optional.</w:t>
+      </w:r>
+    </w:p>
+    <w:p>
+      <w:pPr>
+        <w:pStyle w:val="ListBullet"/>
+      </w:pPr>
+      <w:r>
+        <w:t>Listing fields: use the generic Name of listing label. Supported choices include temple, kavu, holy place, Jain temple, Buddhist pagoda, festival and service; exclude church and mosque.</w:t>
+      </w:r>
+    </w:p>
+    <w:p>
+      <w:pPr>
+        <w:pStyle w:val="ListBullet"/>
+      </w:pPr>
+      <w:r>
+        <w:t>Temple master data: Main deity 1, optional Main deity 2 and other deity selections come from staff-managed deity master data.</w:t>
+      </w:r>
+    </w:p>
+    <w:p>
+      <w:pPr>
+        <w:pStyle w:val="ListBullet"/>
+      </w:pPr>
+      <w:r>
+        <w:t>Contacts: keep official public phone/email separately from private committee-member phone/email. Public contacts receive booking WhatsApp/email notifications; private contacts are for verification and support.</w:t>
+      </w:r>
+    </w:p>
+    <w:p>
+      <w:pPr>
+        <w:pStyle w:val="ListBullet"/>
+      </w:pPr>
+      <w:r>
+        <w:t>Sponsorship: offer self sponsorship without branding and third-party sponsorship with optional sponsor name, GSTIN, logo, banner and ad text. Packages are Supporter, Patron, Benefactor and the one-time Temple Billing mini ERP.</w:t>
+      </w:r>
+    </w:p>
+    <w:p>
+      <w:pPr>
+        <w:pStyle w:val="ListBullet"/>
+      </w:pPr>
+      <w:r>
+        <w:t>Partner attribution: validate a partner code before checkout and show the matched partner name or an invalid-code message. Remove the separate Sell a product action from the partner dashboard.</w:t>
+      </w:r>
+    </w:p>
+    <w:p>
+      <w:pPr>
+        <w:pStyle w:val="ListBullet"/>
+      </w:pPr>
+      <w:r>
+        <w:t>Payments: gateways such as Omniware, Federal Bank and Stripe can confirm automatically. UPI, bank transfer and cheque require payment details and staff verification; issue only a provisional receipt until verification. Show a default UPI QR and do not request branch details.</w:t>
+      </w:r>
+    </w:p>
+    <w:p>
+      <w:pPr>
+        <w:pStyle w:val="ListBullet"/>
+      </w:pPr>
+      <w:r>
+        <w:t>Tax and activation: sponsorship checkout issues a tax invoice with seller tax details and correct line items, never an 80G receipt. Activate plans after confirmed payment. Mini ERP buyers receive the temple code, activation UUID, download link and activation steps in their user or partner account.</w:t>
       </w:r>
     </w:p>
     <w:sectPr>

</xml_diff>